<commit_message>
Documentazione: tradotte le ultime intestazioni di tabella rimaste in italiano
'Tabella'/'Contenuto' nella sezione 6.3 (Relational Database) e 'Contenuto'
nella 6.2 (File System) erano rimaste non tradotte dal passaggio di
traduzione precedente; ora sono 'Table'/'Content' come nel resto del
documento.

Co-Authored-By: Claude Sonnet 5 <noreply@anthropic.com>
</commit_message>
<xml_diff>
--- a/docs/UniRide_Technical_Documentation.docx
+++ b/docs/UniRide_Technical_Documentation.docx
@@ -3697,7 +3697,7 @@
                 <w:sz w:val="20"/>
                 <w:szCs w:val="20"/>
               </w:rPr>
-              <w:t xml:space="preserve">Contenuto</w:t>
+              <w:t xml:space="preserve">Content</w:t>
             </w:r>
           </w:p>
         </w:tc>
@@ -3909,7 +3909,7 @@
                 <w:sz w:val="20"/>
                 <w:szCs w:val="20"/>
               </w:rPr>
-              <w:t xml:space="preserve">Tabella</w:t>
+              <w:t xml:space="preserve">Table</w:t>
             </w:r>
           </w:p>
         </w:tc>
@@ -3933,7 +3933,7 @@
                 <w:sz w:val="20"/>
                 <w:szCs w:val="20"/>
               </w:rPr>
-              <w:t xml:space="preserve">Contenuto</w:t>
+              <w:t xml:space="preserve">Content</w:t>
             </w:r>
           </w:p>
         </w:tc>

</xml_diff>

<commit_message>
Documentazione: tabella SonarCloud aggiornata ai valori reali
Quality gate superato sul branch principale dopo il merge della PR #4:
0 bug, 0 vulnerabilità, 0 security hotspot, 0 code smell; coverage 83%,
duplicazioni 4,8%.

Co-Authored-By: Claude Opus 5.5 <noreply@anthropic.com>
</commit_message>
<xml_diff>
--- a/docs/UniRide_Technical_Documentation.docx
+++ b/docs/UniRide_Technical_Documentation.docx
@@ -4604,7 +4604,7 @@
         <w:spacing w:after="160"/>
       </w:pPr>
       <w:r>
-        <w:t xml:space="preserve">The current state of the quality gate, verified through SonarCloud's public API, is as follows:</w:t>
+        <w:t xml:space="preserve">The current state of the quality gate (passed), verified through SonarCloud's public API on the latest analysis of the default branch, is as follows:</w:t>
       </w:r>
     </w:p>
     <w:tbl>
@@ -5048,7 +5048,7 @@
                 <w:sz w:val="20"/>
                 <w:szCs w:val="20"/>
               </w:rPr>
-              <w:t xml:space="preserve">~86% (Controller/Model/DAO; Boundary excluded, see note)</w:t>
+              <w:t xml:space="preserve">~83% (Controller/Model/DAO; Boundary excluded, see note)</w:t>
             </w:r>
           </w:p>
         </w:tc>
@@ -5119,7 +5119,7 @@
                 <w:sz w:val="20"/>
                 <w:szCs w:val="20"/>
               </w:rPr>
-              <w:t xml:space="preserve">6.7% (not required by the course, see note)</w:t>
+              <w:t xml:space="preserve">4.8% (not required by the course, see note)</w:t>
             </w:r>
           </w:p>
         </w:tc>

</xml_diff>